<commit_message>
Logo created. Logop inserted in all user's guide.
</commit_message>
<xml_diff>
--- a/.codex/skills/emulators-documentation-authoring/assets/emulators-documentation-template.docx
+++ b/.codex/skills/emulators-documentation-authoring/assets/emulators-documentation-template.docx
@@ -745,8 +745,8 @@
   <w:p>
     <w:pPr>
       <w:tabs>
-        <w:tab w:val="center" w:pos="4550"/>
-        <w:tab w:val="left" w:pos="5818"/>
+        <w:tab w:val="left" w:pos="0"/>
+        <w:tab w:val="right" w:pos="8900"/>
       </w:tabs>
       <w:ind w:right="260"/>
       <w:jc w:val="right"/>
@@ -756,6 +756,43 @@
         <w:szCs w:val="24"/>
       </w:rPr>
     </w:pPr>
+    <w:r>
+      <w:drawing>
+        <wp:inline xmlns:a="http://schemas.openxmlformats.org/drawingml/2006/main" xmlns:pic="http://schemas.openxmlformats.org/drawingml/2006/picture">
+          <wp:extent cx="576000" cy="459360"/>
+          <wp:docPr id="1" name="ARGOS framework mark" descr="ARGOS framework mark"/>
+          <wp:cNvGraphicFramePr>
+            <a:graphicFrameLocks noChangeAspect="1"/>
+          </wp:cNvGraphicFramePr>
+          <a:graphic>
+            <a:graphicData uri="http://schemas.openxmlformats.org/drawingml/2006/picture">
+              <pic:pic>
+                <pic:nvPicPr>
+                  <pic:cNvPr id="0" name="argos-mark-transparent.png"/>
+                  <pic:cNvPicPr/>
+                </pic:nvPicPr>
+                <pic:blipFill>
+                  <a:blip r:embed="rId1"/>
+                  <a:stretch>
+                    <a:fillRect/>
+                  </a:stretch>
+                </pic:blipFill>
+                <pic:spPr>
+                  <a:xfrm>
+                    <a:off x="0" y="0"/>
+                    <a:ext cx="576000" cy="459360"/>
+                  </a:xfrm>
+                  <a:prstGeom prst="rect"/>
+                </pic:spPr>
+              </pic:pic>
+            </a:graphicData>
+          </a:graphic>
+        </wp:inline>
+      </w:drawing>
+    </w:r>
+    <w:r>
+      <w:tab/>
+    </w:r>
     <w:r>
       <w:rPr>
         <w:color w:val="8496B0" w:themeColor="text2" w:themeTint="99"/>
@@ -992,6 +1029,7 @@
   <w:p>
     <w:pPr>
       <w:pStyle w:val="Encabezado"/>
+      <w:jc w:val="left"/>
     </w:pPr>
     <w:r>
       <w:rPr>
@@ -1028,6 +1066,40 @@
           <w10:wrap anchorx="margin" anchory="margin"/>
         </v:shape>
       </w:pict>
+    </w:r>
+    <w:r>
+      <w:drawing>
+        <wp:inline xmlns:a="http://schemas.openxmlformats.org/drawingml/2006/main" xmlns:pic="http://schemas.openxmlformats.org/drawingml/2006/picture">
+          <wp:extent cx="1512000" cy="1205820"/>
+          <wp:docPr id="1" name="ARGOS framework mark" descr="ARGOS framework mark"/>
+          <wp:cNvGraphicFramePr>
+            <a:graphicFrameLocks noChangeAspect="1"/>
+          </wp:cNvGraphicFramePr>
+          <a:graphic>
+            <a:graphicData uri="http://schemas.openxmlformats.org/drawingml/2006/picture">
+              <pic:pic>
+                <pic:nvPicPr>
+                  <pic:cNvPr id="0" name="argos-mark-transparent.png"/>
+                  <pic:cNvPicPr/>
+                </pic:nvPicPr>
+                <pic:blipFill>
+                  <a:blip r:embed="rId1"/>
+                  <a:stretch>
+                    <a:fillRect/>
+                  </a:stretch>
+                </pic:blipFill>
+                <pic:spPr>
+                  <a:xfrm>
+                    <a:off x="0" y="0"/>
+                    <a:ext cx="1512000" cy="1205820"/>
+                  </a:xfrm>
+                  <a:prstGeom prst="rect"/>
+                </pic:spPr>
+              </pic:pic>
+            </a:graphicData>
+          </a:graphic>
+        </wp:inline>
+      </w:drawing>
     </w:r>
   </w:p>
 </w:hdr>

</xml_diff>